<commit_message>
docs: complete final docx
</commit_message>
<xml_diff>
--- a/DOCX/TaiLieuThietKe/20_Thiet_ke_Wireframe_Handler_Admin.docx
+++ b/DOCX/TaiLieuThietKe/20_Thiet_ke_Wireframe_Handler_Admin.docx
@@ -1,6 +1,6 @@
 
 <file path=word/document.xml><?xml version="1.0" encoding="utf-8"?>
-<w:document xmlns:wpc="http://schemas.microsoft.com/office/word/2010/wordprocessingCanvas" xmlns:cx="http://schemas.microsoft.com/office/drawing/2014/chartex" xmlns:cx1="http://schemas.microsoft.com/office/drawing/2015/9/8/chartex" xmlns:cx2="http://schemas.microsoft.com/office/drawing/2015/10/21/chartex" xmlns:cx3="http://schemas.microsoft.com/office/drawing/2016/5/9/chartex" xmlns:cx4="http://schemas.microsoft.com/office/drawing/2016/5/10/chartex" xmlns:cx5="http://schemas.microsoft.com/office/drawing/2016/5/11/chartex" xmlns:cx6="http://schemas.microsoft.com/office/drawing/2016/5/12/chartex" xmlns:cx7="http://schemas.microsoft.com/office/drawing/2016/5/13/chartex" xmlns:cx8="http://schemas.microsoft.com/office/drawing/2016/5/14/chartex" xmlns:mc="http://schemas.openxmlformats.org/markup-compatibility/2006" xmlns:aink="http://schemas.microsoft.com/office/drawing/2016/ink" xmlns:am3d="http://schemas.microsoft.com/office/drawing/2017/model3d" xmlns:o="urn:schemas-microsoft-com:office:office" xmlns:oel="http://schemas.microsoft.com/office/2019/extlst" xmlns:r="http://schemas.openxmlformats.org/officeDocument/2006/relationships" xmlns:m="http://schemas.openxmlformats.org/officeDocument/2006/math" xmlns:v="urn:schemas-microsoft-com:vml" xmlns:wp14="http://schemas.microsoft.com/office/word/2010/wordprocessingDrawing" xmlns:wp="http://schemas.openxmlformats.org/drawingml/2006/wordprocessingDrawing" xmlns:w10="urn:schemas-microsoft-com:office:word" xmlns:w="http://schemas.openxmlformats.org/wordprocessingml/2006/main" xmlns:w14="http://schemas.microsoft.com/office/word/2010/wordml" xmlns:w15="http://schemas.microsoft.com/office/word/2012/wordml" xmlns:w16cei="http://schemas.microsoft.com/office/word/2026/wordml/cei" xmlns:w16cex="http://schemas.microsoft.com/office/word/2018/wordml/cex" xmlns:w16cid="http://schemas.microsoft.com/office/word/2016/wordml/cid" xmlns:w16="http://schemas.microsoft.com/office/word/2018/wordml" xmlns:w16du="http://schemas.microsoft.com/office/word/2023/wordml/word16du" xmlns:w16sdtdh="http://schemas.microsoft.com/office/word/2020/wordml/sdtdatahash" xmlns:w16sdtfl="http://schemas.microsoft.com/office/word/2024/wordml/sdtformatlock" xmlns:w16se="http://schemas.microsoft.com/office/word/2015/wordml/symex" xmlns:wpg="http://schemas.microsoft.com/office/word/2010/wordprocessingGroup" xmlns:wpi="http://schemas.microsoft.com/office/word/2010/wordprocessingInk" xmlns:wne="http://schemas.microsoft.com/office/word/2006/wordml" xmlns:wps="http://schemas.microsoft.com/office/word/2010/wordprocessingShape" mc:Ignorable="w14 w15 w16se w16cid w16 w16cex w16sdtdh w16sdtfl w16du wp14">
+<w:document xmlns:wpc="http://schemas.microsoft.com/office/word/2010/wordprocessingCanvas" xmlns:cx="http://schemas.microsoft.com/office/drawing/2014/chartex" xmlns:cx1="http://schemas.microsoft.com/office/drawing/2015/9/8/chartex" xmlns:cx2="http://schemas.microsoft.com/office/drawing/2015/10/21/chartex" xmlns:cx3="http://schemas.microsoft.com/office/drawing/2016/5/9/chartex" xmlns:cx4="http://schemas.microsoft.com/office/drawing/2016/5/10/chartex" xmlns:cx5="http://schemas.microsoft.com/office/drawing/2016/5/11/chartex" xmlns:cx6="http://schemas.microsoft.com/office/drawing/2016/5/12/chartex" xmlns:cx7="http://schemas.microsoft.com/office/drawing/2016/5/13/chartex" xmlns:cx8="http://schemas.microsoft.com/office/drawing/2016/5/14/chartex" xmlns:mc="http://schemas.openxmlformats.org/markup-compatibility/2006" xmlns:aink="http://schemas.microsoft.com/office/drawing/2016/ink" xmlns:am3d="http://schemas.microsoft.com/office/drawing/2017/model3d" xmlns:o="urn:schemas-microsoft-com:office:office" xmlns:oel="http://schemas.microsoft.com/office/2019/extlst" xmlns:r="http://schemas.openxmlformats.org/officeDocument/2006/relationships" xmlns:m="http://schemas.openxmlformats.org/officeDocument/2006/math" xmlns:v="urn:schemas-microsoft-com:vml" xmlns:wp14="http://schemas.microsoft.com/office/word/2010/wordprocessingDrawing" xmlns:wp="http://schemas.openxmlformats.org/drawingml/2006/wordprocessingDrawing" xmlns:w10="urn:schemas-microsoft-com:office:word" xmlns:w="http://schemas.openxmlformats.org/wordprocessingml/2006/main" xmlns:w14="http://schemas.microsoft.com/office/word/2010/wordml" xmlns:w15="http://schemas.microsoft.com/office/word/2012/wordml" xmlns:w16cex="http://schemas.microsoft.com/office/word/2018/wordml/cex" xmlns:w16cid="http://schemas.microsoft.com/office/word/2016/wordml/cid" xmlns:w16="http://schemas.microsoft.com/office/word/2018/wordml" xmlns:w16du="http://schemas.microsoft.com/office/word/2023/wordml/word16du" xmlns:w16sdtdh="http://schemas.microsoft.com/office/word/2020/wordml/sdtdatahash" xmlns:w16sdtfl="http://schemas.microsoft.com/office/word/2024/wordml/sdtformatlock" xmlns:w16se="http://schemas.microsoft.com/office/word/2015/wordml/symex" xmlns:wpg="http://schemas.microsoft.com/office/word/2010/wordprocessingGroup" xmlns:wpi="http://schemas.microsoft.com/office/word/2010/wordprocessingInk" xmlns:wne="http://schemas.microsoft.com/office/word/2006/wordml" xmlns:wps="http://schemas.microsoft.com/office/word/2010/wordprocessingShape" mc:Ignorable="w14 w15 w16se w16cid w16 w16cex w16sdtdh w16sdtfl w16du wp14">
   <w:body>
     <w:p>
       <w:pPr>
@@ -55,8 +55,8 @@
       </w:tblPr>
       <w:tblGrid>
         <w:gridCol w:w="1705"/>
-        <w:gridCol w:w="4511"/>
-        <w:gridCol w:w="2800"/>
+        <w:gridCol w:w="4898"/>
+        <w:gridCol w:w="2413"/>
       </w:tblGrid>
       <w:tr>
         <w:tc>
@@ -151,21 +151,21 @@
               <w:jc w:val="both"/>
             </w:pPr>
             <w:r>
-              <w:t>Xem ticket được phân công; Start, Request info, Resolve, Resume; PUBLIC/INTERNAL comment; xem SLA trong phạm vi.</w:t>
-            </w:r>
-          </w:p>
-        </w:tc>
-        <w:tc>
-          <w:tcPr>
-            <w:tcW w:w="0" w:type="auto"/>
-          </w:tcPr>
-          <w:p>
-            <w:pPr>
-              <w:spacing w:line="360" w:lineRule="auto"/>
-              <w:jc w:val="both"/>
-            </w:pPr>
-            <w:r>
-              <w:t>Không tự phân công, đổi classification, từ chối NEW hoặc quản trị chính sách.</w:t>
+              <w:t>Xem ticket được phân công; Start, Request info, Resolve, Resume; trao đổi PUBLIC/INTERNAL; xem SLA trong phạm vi.</w:t>
+            </w:r>
+          </w:p>
+        </w:tc>
+        <w:tc>
+          <w:tcPr>
+            <w:tcW w:w="0" w:type="auto"/>
+          </w:tcPr>
+          <w:p>
+            <w:pPr>
+              <w:spacing w:line="360" w:lineRule="auto"/>
+              <w:jc w:val="both"/>
+            </w:pPr>
+            <w:r>
+              <w:t>Không tự phân công, từ chối ticket NEW hoặc truy cập chức năng quản trị.</w:t>
             </w:r>
           </w:p>
         </w:tc>
@@ -195,7 +195,7 @@
               <w:jc w:val="both"/>
             </w:pPr>
             <w:r>
-              <w:t>Xem toàn bộ; phân công/điều chuyển; đổi category/priority; thực hiện workflow khi cần; từ chối NEW; quản trị SLA, user/role, catalog và audit.</w:t>
+              <w:t>Xem toàn bộ ticket; phân công hoặc điều chuyển; thực hiện workflow hợp lệ; từ chối ticket NEW; giám sát SLA; quản trị tài khoản, vai trò, danh mục và Audit Log.</w:t>
             </w:r>
           </w:p>
         </w:tc>
@@ -511,8 +511,8 @@
         <w:tblLook w:val="04A0" w:firstRow="1" w:lastRow="0" w:firstColumn="1" w:lastColumn="0" w:noHBand="0" w:noVBand="1"/>
       </w:tblPr>
       <w:tblGrid>
-        <w:gridCol w:w="2292"/>
-        <w:gridCol w:w="6724"/>
+        <w:gridCol w:w="2224"/>
+        <w:gridCol w:w="6792"/>
       </w:tblGrid>
       <w:tr>
         <w:trPr>
@@ -736,9 +736,12 @@
             <w:pPr>
               <w:spacing w:line="360" w:lineRule="auto"/>
               <w:jc w:val="both"/>
-            </w:pPr>
-            <w:r>
-              <w:t>Giám sát runtime và quản trị phiên bản SLA Policy.</w:t>
+              <w:rPr>
+                <w:lang w:val="vi-VN"/>
+              </w:rPr>
+            </w:pPr>
+            <w:r>
+              <w:t>Giám sát cảnh báo SLA, lọc theo trạng thái, loại SLA, ticket và thời gian.</w:t>
             </w:r>
           </w:p>
         </w:tc>
@@ -766,9 +769,12 @@
             <w:pPr>
               <w:spacing w:line="360" w:lineRule="auto"/>
               <w:jc w:val="both"/>
-            </w:pPr>
-            <w:r>
-              <w:t>User/Role/Department, Category/Priority và Audit log.</w:t>
+              <w:rPr>
+                <w:lang w:val="vi-VN"/>
+              </w:rPr>
+            </w:pPr>
+            <w:r>
+              <w:t>Tài khoản và vai trò, danh mục phòng ban tham chiếu, Category/Priority và Audit Log.</w:t>
             </w:r>
           </w:p>
         </w:tc>
@@ -928,9 +934,9 @@
         <w:tblLook w:val="04A0" w:firstRow="1" w:lastRow="0" w:firstColumn="1" w:lastColumn="0" w:noHBand="0" w:noVBand="1"/>
       </w:tblPr>
       <w:tblGrid>
-        <w:gridCol w:w="740"/>
+        <w:gridCol w:w="885"/>
         <w:gridCol w:w="1343"/>
-        <w:gridCol w:w="4463"/>
+        <w:gridCol w:w="4318"/>
         <w:gridCol w:w="2470"/>
       </w:tblGrid>
       <w:tr>
@@ -1462,7 +1468,10 @@
               <w:jc w:val="both"/>
             </w:pPr>
             <w:r>
-              <w:t>NEAR_DUE/OVERDUE/ESCALATED trong phạm vi.</w:t>
+              <w:t>WARNING/OVERDUE/ESCALATED</w:t>
+            </w:r>
+            <w:r>
+              <w:t xml:space="preserve"> trong phạm vi.</w:t>
             </w:r>
           </w:p>
         </w:tc>
@@ -1578,21 +1587,21 @@
               <w:jc w:val="both"/>
             </w:pPr>
             <w:r>
-              <w:t>Phân công, điều chuyển, classification hoặc reject NEW.</w:t>
-            </w:r>
-          </w:p>
-        </w:tc>
-        <w:tc>
-          <w:tcPr>
-            <w:tcW w:w="0" w:type="auto"/>
-          </w:tcPr>
-          <w:p>
-            <w:pPr>
-              <w:spacing w:line="360" w:lineRule="auto"/>
-              <w:jc w:val="both"/>
-            </w:pPr>
-            <w:r>
-              <w:t>ASN-01/02, TKT-05, WF-08</w:t>
+              <w:t>Lọc ticket NEW, mở chi tiết ticket, phân công hoặc điều chuyển Processor và từ chối ticket NEW khi cần.</w:t>
+            </w:r>
+          </w:p>
+        </w:tc>
+        <w:tc>
+          <w:tcPr>
+            <w:tcW w:w="0" w:type="auto"/>
+          </w:tcPr>
+          <w:p>
+            <w:pPr>
+              <w:spacing w:line="360" w:lineRule="auto"/>
+              <w:jc w:val="both"/>
+            </w:pPr>
+            <w:r>
+              <w:t>ASN-01/02, TKT-02/03, WF-08</w:t>
             </w:r>
           </w:p>
         </w:tc>
@@ -1678,37 +1687,66 @@
             <w:pPr>
               <w:spacing w:line="360" w:lineRule="auto"/>
               <w:jc w:val="both"/>
-            </w:pPr>
-            <w:r>
-              <w:t>SLA Policy</w:t>
-            </w:r>
-          </w:p>
-        </w:tc>
-        <w:tc>
-          <w:tcPr>
-            <w:tcW w:w="0" w:type="auto"/>
-          </w:tcPr>
-          <w:p>
-            <w:pPr>
-              <w:spacing w:line="360" w:lineRule="auto"/>
-              <w:jc w:val="both"/>
-            </w:pPr>
-            <w:r>
-              <w:t>Tra cứu và tạo/đóng phiên bản chính sách.</w:t>
-            </w:r>
-          </w:p>
-        </w:tc>
-        <w:tc>
-          <w:tcPr>
-            <w:tcW w:w="0" w:type="auto"/>
-          </w:tcPr>
-          <w:p>
-            <w:pPr>
-              <w:spacing w:line="360" w:lineRule="auto"/>
-              <w:jc w:val="both"/>
-            </w:pPr>
-            <w:r>
-              <w:t>SLA-03/04/05/06</w:t>
+              <w:rPr>
+                <w:lang w:val="vi-VN"/>
+              </w:rPr>
+            </w:pPr>
+            <w:r>
+              <w:t>Tạo</w:t>
+            </w:r>
+            <w:r>
+              <w:rPr>
+                <w:lang w:val="vi-VN"/>
+              </w:rPr>
+              <w:t xml:space="preserve"> tài khoản</w:t>
+            </w:r>
+          </w:p>
+        </w:tc>
+        <w:tc>
+          <w:tcPr>
+            <w:tcW w:w="0" w:type="auto"/>
+          </w:tcPr>
+          <w:p>
+            <w:pPr>
+              <w:spacing w:line="360" w:lineRule="auto"/>
+              <w:jc w:val="both"/>
+              <w:rPr>
+                <w:lang w:val="vi-VN"/>
+              </w:rPr>
+            </w:pPr>
+            <w:r>
+              <w:t>Tạo</w:t>
+            </w:r>
+            <w:r>
+              <w:rPr>
+                <w:lang w:val="vi-VN"/>
+              </w:rPr>
+              <w:t xml:space="preserve"> tài khoản, chọn phòng ban, gán 1-3 vai trò và thiết lập trạng thái hoạt động.</w:t>
+            </w:r>
+          </w:p>
+        </w:tc>
+        <w:tc>
+          <w:tcPr>
+            <w:tcW w:w="0" w:type="auto"/>
+          </w:tcPr>
+          <w:p>
+            <w:pPr>
+              <w:jc w:val="both"/>
+              <w:rPr>
+                <w:lang w:val="vi-VN"/>
+              </w:rPr>
+            </w:pPr>
+            <w:r>
+              <w:t>ADM-00</w:t>
+            </w:r>
+            <w:r>
+              <w:rPr>
+                <w:lang w:val="vi-VN"/>
+              </w:rPr>
+              <w:t>/06/</w:t>
+            </w:r>
+            <w:r>
+              <w:t>07</w:t>
             </w:r>
           </w:p>
         </w:tc>
@@ -1908,6 +1946,18 @@
       </w:pPr>
       <w:r>
         <w:t>Các wireframe dùng viewport desktop 1440 x 900 px. Màu chỉ hỗ trợ phân biệt vai trò, trạng thái và mức độ cảnh báo; đây chưa phải visual design cuối cùng.</w:t>
+      </w:r>
+    </w:p>
+    <w:p>
+      <w:pPr>
+        <w:spacing w:after="0" w:line="360" w:lineRule="auto"/>
+        <w:jc w:val="both"/>
+        <w:rPr>
+          <w:lang w:val="vi-VN"/>
+        </w:rPr>
+      </w:pPr>
+      <w:r>
+        <w:t>Các wireframe thể hiện phương án thiết kế chức năng và luồng tương tác. Giao diện triển khai thực tế có thể điều chỉnh về bố cục, màu sắc và thành phần trình bày, nhưng vẫn bảo đảm chức năng, phân quyền và quy tắc nghiệp vụ đã mô tả.</w:t>
       </w:r>
     </w:p>
     <w:p>
@@ -2505,13 +2555,12 @@
       <w:r>
         <w:rPr>
           <w:noProof/>
-          <w:lang w:val="vi-VN"/>
         </w:rPr>
         <w:drawing>
-          <wp:inline distT="0" distB="0" distL="0" distR="0" wp14:anchorId="4ABAEEBA" wp14:editId="32C8B91F">
-            <wp:extent cx="5731510" cy="3585210"/>
+          <wp:inline distT="0" distB="0" distL="0" distR="0" wp14:anchorId="0E356FFE" wp14:editId="68FAA64E">
+            <wp:extent cx="5731510" cy="3586480"/>
             <wp:effectExtent l="0" t="0" r="2540" b="0"/>
-            <wp:docPr id="577922760" name="Picture 96"/>
+            <wp:docPr id="1183333588" name="Picture 1"/>
             <wp:cNvGraphicFramePr>
               <a:graphicFrameLocks xmlns:a="http://schemas.openxmlformats.org/drawingml/2006/main" noChangeAspect="1"/>
             </wp:cNvGraphicFramePr>
@@ -2519,8 +2568,10 @@
               <a:graphicData uri="http://schemas.openxmlformats.org/drawingml/2006/picture">
                 <pic:pic xmlns:pic="http://schemas.openxmlformats.org/drawingml/2006/picture">
                   <pic:nvPicPr>
-                    <pic:cNvPr id="577922760" name="Picture 577922760"/>
-                    <pic:cNvPicPr/>
+                    <pic:cNvPr id="0" name="Picture 1"/>
+                    <pic:cNvPicPr>
+                      <a:picLocks noChangeAspect="1" noChangeArrowheads="1"/>
+                    </pic:cNvPicPr>
                   </pic:nvPicPr>
                   <pic:blipFill>
                     <a:blip r:embed="rId13" cstate="print">
@@ -2530,18 +2581,23 @@
                         </a:ext>
                       </a:extLst>
                     </a:blip>
+                    <a:srcRect/>
                     <a:stretch>
                       <a:fillRect/>
                     </a:stretch>
                   </pic:blipFill>
-                  <pic:spPr>
+                  <pic:spPr bwMode="auto">
                     <a:xfrm>
                       <a:off x="0" y="0"/>
-                      <a:ext cx="5731510" cy="3585210"/>
+                      <a:ext cx="5731510" cy="3586480"/>
                     </a:xfrm>
                     <a:prstGeom prst="rect">
                       <a:avLst/>
                     </a:prstGeom>
+                    <a:noFill/>
+                    <a:ln>
+                      <a:noFill/>
+                    </a:ln>
                   </pic:spPr>
                 </pic:pic>
               </a:graphicData>
@@ -2871,9 +2927,27 @@
       <w:pPr>
         <w:pStyle w:val="Heading3"/>
         <w:spacing w:before="0" w:after="0" w:line="360" w:lineRule="auto"/>
+        <w:rPr>
+          <w:lang w:val="vi-VN"/>
+        </w:rPr>
       </w:pPr>
       <w:r>
-        <w:t>20.7.11. WF-HA-11 - Quản trị SLA Policy</w:t>
+        <w:t xml:space="preserve">20.7.11. WF-HA-11 </w:t>
+      </w:r>
+      <w:r>
+        <w:t>–</w:t>
+      </w:r>
+      <w:r>
+        <w:t xml:space="preserve"> </w:t>
+      </w:r>
+      <w:r>
+        <w:t>Tạo</w:t>
+      </w:r>
+      <w:r>
+        <w:rPr>
+          <w:lang w:val="vi-VN"/>
+        </w:rPr>
+        <w:t xml:space="preserve"> tài khoản</w:t>
       </w:r>
     </w:p>
     <w:p>
@@ -2890,10 +2964,10 @@
           <w:lang w:val="vi-VN"/>
         </w:rPr>
         <w:drawing>
-          <wp:inline distT="0" distB="0" distL="0" distR="0" wp14:anchorId="5A7E2E10" wp14:editId="45886D1B">
+          <wp:inline distT="0" distB="0" distL="0" distR="0" wp14:anchorId="3CEE18C7" wp14:editId="73B2F13D">
             <wp:extent cx="5731510" cy="3585210"/>
             <wp:effectExtent l="0" t="0" r="2540" b="0"/>
-            <wp:docPr id="245874963" name="Picture 100"/>
+            <wp:docPr id="1624303727" name="Picture 1"/>
             <wp:cNvGraphicFramePr>
               <a:graphicFrameLocks xmlns:a="http://schemas.openxmlformats.org/drawingml/2006/main" noChangeAspect="1"/>
             </wp:cNvGraphicFramePr>
@@ -2901,7 +2975,7 @@
               <a:graphicData uri="http://schemas.openxmlformats.org/drawingml/2006/picture">
                 <pic:pic xmlns:pic="http://schemas.openxmlformats.org/drawingml/2006/picture">
                   <pic:nvPicPr>
-                    <pic:cNvPr id="245874963" name="Picture 245874963"/>
+                    <pic:cNvPr id="1624303727" name="Picture 1624303727"/>
                     <pic:cNvPicPr/>
                   </pic:nvPicPr>
                   <pic:blipFill>
@@ -2959,7 +3033,16 @@
         </w:r>
       </w:fldSimple>
       <w:r>
-        <w:t>. Danh sách và tạo phiên bản SLA Policy</w:t>
+        <w:t xml:space="preserve">. </w:t>
+      </w:r>
+      <w:r>
+        <w:t>Tạo</w:t>
+      </w:r>
+      <w:r>
+        <w:rPr>
+          <w:lang w:val="vi-VN"/>
+        </w:rPr>
+        <w:t xml:space="preserve"> tài khoản mới và phân quyền ban đầu</w:t>
       </w:r>
     </w:p>
     <w:p>
@@ -3431,7 +3514,7 @@
               <w:jc w:val="both"/>
             </w:pPr>
             <w:r>
-              <w:t>ASN-01, TKT-05, WF-08</w:t>
+              <w:t>ASN-01, WF-08</w:t>
             </w:r>
           </w:p>
         </w:tc>
@@ -3869,8 +3952,8 @@
         <w:tblLook w:val="04A0" w:firstRow="1" w:lastRow="0" w:firstColumn="1" w:lastColumn="0" w:noHBand="0" w:noVBand="1"/>
       </w:tblPr>
       <w:tblGrid>
-        <w:gridCol w:w="1839"/>
-        <w:gridCol w:w="7177"/>
+        <w:gridCol w:w="1601"/>
+        <w:gridCol w:w="7415"/>
       </w:tblGrid>
       <w:tr>
         <w:trPr>
@@ -4173,21 +4256,27 @@
               <w:jc w:val="both"/>
             </w:pPr>
             <w:r>
-              <w:t>Policy version</w:t>
-            </w:r>
-          </w:p>
-        </w:tc>
-        <w:tc>
-          <w:tcPr>
-            <w:tcW w:w="0" w:type="auto"/>
-          </w:tcPr>
-          <w:p>
-            <w:pPr>
-              <w:spacing w:line="360" w:lineRule="auto"/>
-              <w:jc w:val="both"/>
-            </w:pPr>
-            <w:r>
-              <w:t>Policy đã được dùng là bất biến; thay mục tiêu bằng version mới, không cho khoảng hiệu lực chồng lấn.</w:t>
+              <w:t>Tạo tài khoản</w:t>
+            </w:r>
+          </w:p>
+        </w:tc>
+        <w:tc>
+          <w:tcPr>
+            <w:tcW w:w="0" w:type="auto"/>
+          </w:tcPr>
+          <w:p>
+            <w:pPr>
+              <w:spacing w:line="360" w:lineRule="auto"/>
+              <w:jc w:val="both"/>
+            </w:pPr>
+            <w:r>
+              <w:t xml:space="preserve">Policy đã được dùng là bất biến; thay mục tiêu bằng version mới, không cho </w:t>
+            </w:r>
+            <w:r>
+              <w:t>Email phải duy nhất; mật khẩu dài 8–128 ký tự; chọn từ 1 đến 3 vai trò không trùng; phòng ban và vai trò phải tồn tại; thao tác được ghi Audit Log với action USER_CREATED.</w:t>
+            </w:r>
+            <w:r>
+              <w:t>hiệu lực chồng lấn.</w:t>
             </w:r>
           </w:p>
         </w:tc>
@@ -4559,6 +4648,7 @@
               <w:jc w:val="both"/>
             </w:pPr>
             <w:r>
+              <w:lastRenderedPageBreak/>
               <w:t>Thiếu lý do từ chối</w:t>
             </w:r>
           </w:p>
@@ -4601,10 +4691,18 @@
             <w:pPr>
               <w:spacing w:line="360" w:lineRule="auto"/>
               <w:jc w:val="both"/>
-            </w:pPr>
-            <w:r>
-              <w:lastRenderedPageBreak/>
-              <w:t>Policy chồng lấn/xung đột</w:t>
+              <w:rPr>
+                <w:lang w:val="vi-VN"/>
+              </w:rPr>
+            </w:pPr>
+            <w:r>
+              <w:t>Email</w:t>
+            </w:r>
+            <w:r>
+              <w:rPr>
+                <w:lang w:val="vi-VN"/>
+              </w:rPr>
+              <w:t xml:space="preserve"> đã được sử dụng</w:t>
             </w:r>
           </w:p>
         </w:tc>
@@ -4616,23 +4714,41 @@
             <w:pPr>
               <w:spacing w:line="360" w:lineRule="auto"/>
               <w:jc w:val="both"/>
-            </w:pPr>
-            <w:r>
-              <w:t>SLA_POLICY_OVERLAP / SLA_POLICY_VERSION_CONFLICT</w:t>
-            </w:r>
-          </w:p>
-        </w:tc>
-        <w:tc>
-          <w:tcPr>
-            <w:tcW w:w="0" w:type="auto"/>
-          </w:tcPr>
-          <w:p>
-            <w:pPr>
-              <w:spacing w:line="360" w:lineRule="auto"/>
-              <w:jc w:val="both"/>
-            </w:pPr>
-            <w:r>
-              <w:t>Đánh dấu trường effective/version và giữ form.</w:t>
+              <w:rPr>
+                <w:lang w:val="vi-VN"/>
+              </w:rPr>
+            </w:pPr>
+            <w:r>
+              <w:t>USER</w:t>
+            </w:r>
+            <w:r>
+              <w:rPr>
+                <w:lang w:val="vi-VN"/>
+              </w:rPr>
+              <w:t>_EMAIL_CONFLICT</w:t>
+            </w:r>
+          </w:p>
+        </w:tc>
+        <w:tc>
+          <w:tcPr>
+            <w:tcW w:w="0" w:type="auto"/>
+          </w:tcPr>
+          <w:p>
+            <w:pPr>
+              <w:spacing w:line="360" w:lineRule="auto"/>
+              <w:jc w:val="both"/>
+              <w:rPr>
+                <w:lang w:val="vi-VN"/>
+              </w:rPr>
+            </w:pPr>
+            <w:r>
+              <w:t>Giữ</w:t>
+            </w:r>
+            <w:r>
+              <w:rPr>
+                <w:lang w:val="vi-VN"/>
+              </w:rPr>
+              <w:t xml:space="preserve"> dữ liệu biểu mẫu, báo lỗi tại trường email và yêu cầu sử dụng email khác.</w:t>
             </w:r>
           </w:p>
         </w:tc>
@@ -4646,9 +4762,18 @@
             <w:pPr>
               <w:spacing w:line="360" w:lineRule="auto"/>
               <w:jc w:val="both"/>
-            </w:pPr>
-            <w:r>
-              <w:t>Policy đã được sử dụng</w:t>
+              <w:rPr>
+                <w:lang w:val="vi-VN"/>
+              </w:rPr>
+            </w:pPr>
+            <w:r>
+              <w:t>Phòng</w:t>
+            </w:r>
+            <w:r>
+              <w:rPr>
+                <w:lang w:val="vi-VN"/>
+              </w:rPr>
+              <w:t xml:space="preserve"> ban không tồn tại</w:t>
             </w:r>
           </w:p>
         </w:tc>
@@ -4660,23 +4785,183 @@
             <w:pPr>
               <w:spacing w:line="360" w:lineRule="auto"/>
               <w:jc w:val="both"/>
-            </w:pPr>
-            <w:r>
-              <w:t>SLA_POLICY_IN_USE</w:t>
-            </w:r>
-          </w:p>
-        </w:tc>
-        <w:tc>
-          <w:tcPr>
-            <w:tcW w:w="0" w:type="auto"/>
-          </w:tcPr>
-          <w:p>
-            <w:pPr>
-              <w:spacing w:line="360" w:lineRule="auto"/>
-              <w:jc w:val="both"/>
-            </w:pPr>
-            <w:r>
-              <w:t>Khóa mục tiêu; đề xuất tạo version mới.</w:t>
+              <w:rPr>
+                <w:lang w:val="vi-VN"/>
+              </w:rPr>
+            </w:pPr>
+            <w:r>
+              <w:t>DEPARTMENT</w:t>
+            </w:r>
+            <w:r>
+              <w:rPr>
+                <w:lang w:val="vi-VN"/>
+              </w:rPr>
+              <w:t>_NOT_FOUND</w:t>
+            </w:r>
+          </w:p>
+        </w:tc>
+        <w:tc>
+          <w:tcPr>
+            <w:tcW w:w="0" w:type="auto"/>
+          </w:tcPr>
+          <w:p>
+            <w:pPr>
+              <w:spacing w:line="360" w:lineRule="auto"/>
+              <w:jc w:val="both"/>
+              <w:rPr>
+                <w:lang w:val="vi-VN"/>
+              </w:rPr>
+            </w:pPr>
+            <w:r>
+              <w:t>Tải</w:t>
+            </w:r>
+            <w:r>
+              <w:rPr>
+                <w:lang w:val="vi-VN"/>
+              </w:rPr>
+              <w:t xml:space="preserve"> lại danh mục phòng ban và yêu cầu chọn lại.</w:t>
+            </w:r>
+          </w:p>
+        </w:tc>
+      </w:tr>
+      <w:tr>
+        <w:tc>
+          <w:tcPr>
+            <w:tcW w:w="1668" w:type="dxa"/>
+          </w:tcPr>
+          <w:p>
+            <w:pPr>
+              <w:spacing w:line="360" w:lineRule="auto"/>
+              <w:jc w:val="both"/>
+              <w:rPr>
+                <w:lang w:val="vi-VN"/>
+              </w:rPr>
+            </w:pPr>
+            <w:r>
+              <w:t>Vai</w:t>
+            </w:r>
+            <w:r>
+              <w:rPr>
+                <w:lang w:val="vi-VN"/>
+              </w:rPr>
+              <w:t xml:space="preserve"> trò không tồn tại hoặc đã ngừng hoạt động</w:t>
+            </w:r>
+          </w:p>
+        </w:tc>
+        <w:tc>
+          <w:tcPr>
+            <w:tcW w:w="4919" w:type="dxa"/>
+          </w:tcPr>
+          <w:p>
+            <w:pPr>
+              <w:spacing w:line="360" w:lineRule="auto"/>
+              <w:jc w:val="both"/>
+              <w:rPr>
+                <w:lang w:val="vi-VN"/>
+              </w:rPr>
+            </w:pPr>
+            <w:r>
+              <w:t>ROLE</w:t>
+            </w:r>
+            <w:r>
+              <w:rPr>
+                <w:lang w:val="vi-VN"/>
+              </w:rPr>
+              <w:t>_NOT_FOUND</w:t>
+            </w:r>
+          </w:p>
+        </w:tc>
+        <w:tc>
+          <w:tcPr>
+            <w:tcW w:w="0" w:type="auto"/>
+          </w:tcPr>
+          <w:p>
+            <w:pPr>
+              <w:spacing w:line="360" w:lineRule="auto"/>
+              <w:jc w:val="both"/>
+              <w:rPr>
+                <w:lang w:val="vi-VN"/>
+              </w:rPr>
+            </w:pPr>
+            <w:r>
+              <w:t>Tải</w:t>
+            </w:r>
+            <w:r>
+              <w:rPr>
+                <w:lang w:val="vi-VN"/>
+              </w:rPr>
+              <w:t xml:space="preserve"> lại danh sách vai trò yêu cầu chọn lại.</w:t>
+            </w:r>
+          </w:p>
+        </w:tc>
+      </w:tr>
+      <w:tr>
+        <w:tc>
+          <w:tcPr>
+            <w:tcW w:w="1668" w:type="dxa"/>
+          </w:tcPr>
+          <w:p>
+            <w:pPr>
+              <w:spacing w:line="360" w:lineRule="auto"/>
+              <w:jc w:val="both"/>
+              <w:rPr>
+                <w:lang w:val="vi-VN"/>
+              </w:rPr>
+            </w:pPr>
+            <w:r>
+              <w:t>Dữ</w:t>
+            </w:r>
+            <w:r>
+              <w:rPr>
+                <w:lang w:val="vi-VN"/>
+              </w:rPr>
+              <w:t xml:space="preserve"> liệu tạo tài khoản không khớp</w:t>
+            </w:r>
+          </w:p>
+        </w:tc>
+        <w:tc>
+          <w:tcPr>
+            <w:tcW w:w="4919" w:type="dxa"/>
+          </w:tcPr>
+          <w:p>
+            <w:pPr>
+              <w:spacing w:line="360" w:lineRule="auto"/>
+              <w:jc w:val="both"/>
+              <w:rPr>
+                <w:lang w:val="vi-VN"/>
+              </w:rPr>
+            </w:pPr>
+            <w:r>
+              <w:t>VALIDATION</w:t>
+            </w:r>
+            <w:r>
+              <w:rPr>
+                <w:lang w:val="vi-VN"/>
+              </w:rPr>
+              <w:t>_ERROR</w:t>
+            </w:r>
+          </w:p>
+        </w:tc>
+        <w:tc>
+          <w:tcPr>
+            <w:tcW w:w="0" w:type="auto"/>
+          </w:tcPr>
+          <w:p>
+            <w:pPr>
+              <w:spacing w:line="360" w:lineRule="auto"/>
+              <w:jc w:val="both"/>
+              <w:rPr>
+                <w:lang w:val="vi-VN"/>
+              </w:rPr>
+            </w:pPr>
+            <w:r>
+              <w:t>Hiển</w:t>
+            </w:r>
+            <w:r>
+              <w:rPr>
+                <w:lang w:val="vi-VN"/>
+              </w:rPr>
+              <w:t xml:space="preserve"> thị lỗi dưới trường tương ứng và giữ dữ liệu hợp lệ đã nhập.</w:t>
             </w:r>
           </w:p>
         </w:tc>
@@ -4820,6 +5105,7 @@
         <w:spacing w:after="0" w:line="360" w:lineRule="auto"/>
       </w:pPr>
       <w:r>
+        <w:lastRenderedPageBreak/>
         <w:t>20.11. Responsive và accessibility</w:t>
       </w:r>
     </w:p>
@@ -5073,7 +5359,6 @@
               <w:jc w:val="both"/>
             </w:pPr>
             <w:r>
-              <w:lastRenderedPageBreak/>
               <w:t>Modal</w:t>
             </w:r>
           </w:p>
@@ -5423,6 +5708,7 @@
               <w:jc w:val="both"/>
             </w:pPr>
             <w:r>
+              <w:lastRenderedPageBreak/>
               <w:t>Yêu cầu bổ sung</w:t>
             </w:r>
           </w:p>
@@ -5653,9 +5939,18 @@
             <w:pPr>
               <w:spacing w:line="360" w:lineRule="auto"/>
               <w:jc w:val="both"/>
-            </w:pPr>
-            <w:r>
-              <w:t>SLA Policy</w:t>
+              <w:rPr>
+                <w:lang w:val="vi-VN"/>
+              </w:rPr>
+            </w:pPr>
+            <w:r>
+              <w:t>Tạo</w:t>
+            </w:r>
+            <w:r>
+              <w:rPr>
+                <w:lang w:val="vi-VN"/>
+              </w:rPr>
+              <w:t xml:space="preserve"> tài khoản</w:t>
             </w:r>
           </w:p>
         </w:tc>
@@ -5683,37 +5978,46 @@
               <w:jc w:val="both"/>
             </w:pPr>
             <w:r>
-              <w:t>SLA-03/04/05/06</w:t>
-            </w:r>
-          </w:p>
-        </w:tc>
-        <w:tc>
-          <w:tcPr>
-            <w:tcW w:w="0" w:type="auto"/>
-          </w:tcPr>
-          <w:p>
-            <w:pPr>
-              <w:spacing w:line="360" w:lineRule="auto"/>
-              <w:jc w:val="both"/>
-            </w:pPr>
-            <w:r>
-              <w:t>SLA_POLICIES</w:t>
-            </w:r>
-          </w:p>
-        </w:tc>
-      </w:tr>
-      <w:tr>
-        <w:tc>
-          <w:tcPr>
-            <w:tcW w:w="0" w:type="auto"/>
-          </w:tcPr>
-          <w:p>
-            <w:pPr>
-              <w:spacing w:line="360" w:lineRule="auto"/>
-              <w:jc w:val="both"/>
-            </w:pPr>
-            <w:r>
-              <w:t>User/Role</w:t>
+              <w:t>ADM-00, ADM-06, ADM-07</w:t>
+            </w:r>
+          </w:p>
+        </w:tc>
+        <w:tc>
+          <w:tcPr>
+            <w:tcW w:w="0" w:type="auto"/>
+          </w:tcPr>
+          <w:p>
+            <w:pPr>
+              <w:spacing w:line="360" w:lineRule="auto"/>
+              <w:jc w:val="both"/>
+            </w:pPr>
+            <w:r>
+              <w:t>ADM-07USERS, USER_ROLES, ROLES, DEPARTMENTS, AUDIT_LOGS</w:t>
+            </w:r>
+          </w:p>
+        </w:tc>
+      </w:tr>
+      <w:tr>
+        <w:tc>
+          <w:tcPr>
+            <w:tcW w:w="0" w:type="auto"/>
+          </w:tcPr>
+          <w:p>
+            <w:pPr>
+              <w:spacing w:line="360" w:lineRule="auto"/>
+              <w:jc w:val="both"/>
+              <w:rPr>
+                <w:lang w:val="vi-VN"/>
+              </w:rPr>
+            </w:pPr>
+            <w:r>
+              <w:t>Quản</w:t>
+            </w:r>
+            <w:r>
+              <w:rPr>
+                <w:lang w:val="vi-VN"/>
+              </w:rPr>
+              <w:t xml:space="preserve"> lý tài khoản và vai trò</w:t>
             </w:r>
           </w:p>
         </w:tc>
@@ -5771,7 +6075,6 @@
               <w:jc w:val="both"/>
             </w:pPr>
             <w:r>
-              <w:lastRenderedPageBreak/>
               <w:t>Category/Priority</w:t>
             </w:r>
           </w:p>
@@ -5948,6 +6251,7 @@
         </w:rPr>
       </w:pPr>
       <w:r>
+        <w:lastRenderedPageBreak/>
         <w:t>20.13. Tiêu chí nghiệm thu</w:t>
       </w:r>
     </w:p>
@@ -5958,9 +6262,9 @@
         <w:tblLook w:val="04A0" w:firstRow="1" w:lastRow="0" w:firstColumn="1" w:lastColumn="0" w:noHBand="0" w:noVBand="1"/>
       </w:tblPr>
       <w:tblGrid>
-        <w:gridCol w:w="884"/>
-        <w:gridCol w:w="7099"/>
-        <w:gridCol w:w="1033"/>
+        <w:gridCol w:w="794"/>
+        <w:gridCol w:w="7351"/>
+        <w:gridCol w:w="871"/>
       </w:tblGrid>
       <w:tr>
         <w:trPr>
@@ -6322,7 +6626,7 @@
               <w:jc w:val="both"/>
             </w:pPr>
             <w:r>
-              <w:t>Có giám sát NEAR_DUE, OVERDUE, ESCALATED và PAUSED.</w:t>
+              <w:t>Có giám sát cảnh báo WARNING, OVERDUE và ESCALATED; SLA PAUSED được hiển thị trong chi tiết ticket.</w:t>
             </w:r>
           </w:p>
         </w:tc>
@@ -6366,7 +6670,7 @@
               <w:jc w:val="both"/>
             </w:pPr>
             <w:r>
-              <w:t>Có quản trị phiên bản SLA Policy và ràng buộc hiệu lực.</w:t>
+              <w:t>Có tạo tài khoản mới, chọn phòng ban, gán vai trò và thiết lập trạng thái hoạt động.</w:t>
             </w:r>
           </w:p>
         </w:tc>
@@ -6410,7 +6714,7 @@
               <w:jc w:val="both"/>
             </w:pPr>
             <w:r>
-              <w:t>Có quản trị User, Role, Department và chống mất Admin cuối cùng.</w:t>
+              <w:t>Có cập nhật tài khoản, gán/thu hồi vai trò, khóa/mở khóa và bảo vệ vai trò của Admin hoạt động cuối cùng.</w:t>
             </w:r>
           </w:p>
         </w:tc>
@@ -6440,7 +6744,6 @@
               <w:jc w:val="both"/>
             </w:pPr>
             <w:r>
-              <w:lastRenderedPageBreak/>
               <w:t>AC-10</w:t>
             </w:r>
           </w:p>
@@ -6613,6 +6916,7 @@
         <w:spacing w:after="0" w:line="360" w:lineRule="auto"/>
       </w:pPr>
       <w:r>
+        <w:lastRenderedPageBreak/>
         <w:t>20.14. Kết luận</w:t>
       </w:r>
     </w:p>
@@ -6636,7 +6940,7 @@
 </file>
 
 <file path=word/numbering.xml><?xml version="1.0" encoding="utf-8"?>
-<w:numbering xmlns:wpc="http://schemas.microsoft.com/office/word/2010/wordprocessingCanvas" xmlns:cx="http://schemas.microsoft.com/office/drawing/2014/chartex" xmlns:cx1="http://schemas.microsoft.com/office/drawing/2015/9/8/chartex" xmlns:cx2="http://schemas.microsoft.com/office/drawing/2015/10/21/chartex" xmlns:cx3="http://schemas.microsoft.com/office/drawing/2016/5/9/chartex" xmlns:cx4="http://schemas.microsoft.com/office/drawing/2016/5/10/chartex" xmlns:cx5="http://schemas.microsoft.com/office/drawing/2016/5/11/chartex" xmlns:cx6="http://schemas.microsoft.com/office/drawing/2016/5/12/chartex" xmlns:cx7="http://schemas.microsoft.com/office/drawing/2016/5/13/chartex" xmlns:cx8="http://schemas.microsoft.com/office/drawing/2016/5/14/chartex" xmlns:mc="http://schemas.openxmlformats.org/markup-compatibility/2006" xmlns:aink="http://schemas.microsoft.com/office/drawing/2016/ink" xmlns:am3d="http://schemas.microsoft.com/office/drawing/2017/model3d" xmlns:o="urn:schemas-microsoft-com:office:office" xmlns:oel="http://schemas.microsoft.com/office/2019/extlst" xmlns:r="http://schemas.openxmlformats.org/officeDocument/2006/relationships" xmlns:m="http://schemas.openxmlformats.org/officeDocument/2006/math" xmlns:v="urn:schemas-microsoft-com:vml" xmlns:wp14="http://schemas.microsoft.com/office/word/2010/wordprocessingDrawing" xmlns:wp="http://schemas.openxmlformats.org/drawingml/2006/wordprocessingDrawing" xmlns:w10="urn:schemas-microsoft-com:office:word" xmlns:w="http://schemas.openxmlformats.org/wordprocessingml/2006/main" xmlns:w14="http://schemas.microsoft.com/office/word/2010/wordml" xmlns:w15="http://schemas.microsoft.com/office/word/2012/wordml" xmlns:w16cei="http://schemas.microsoft.com/office/word/2026/wordml/cei" xmlns:w16cex="http://schemas.microsoft.com/office/word/2018/wordml/cex" xmlns:w16cid="http://schemas.microsoft.com/office/word/2016/wordml/cid" xmlns:w16="http://schemas.microsoft.com/office/word/2018/wordml" xmlns:w16du="http://schemas.microsoft.com/office/word/2023/wordml/word16du" xmlns:w16sdtdh="http://schemas.microsoft.com/office/word/2020/wordml/sdtdatahash" xmlns:w16sdtfl="http://schemas.microsoft.com/office/word/2024/wordml/sdtformatlock" xmlns:w16se="http://schemas.microsoft.com/office/word/2015/wordml/symex" xmlns:wpg="http://schemas.microsoft.com/office/word/2010/wordprocessingGroup" xmlns:wpi="http://schemas.microsoft.com/office/word/2010/wordprocessingInk" xmlns:wne="http://schemas.microsoft.com/office/word/2006/wordml" xmlns:wps="http://schemas.microsoft.com/office/word/2010/wordprocessingShape" mc:Ignorable="w14 w15 w16se w16cid w16 w16cex w16sdtdh w16sdtfl w16du wp14">
+<w:numbering xmlns:wpc="http://schemas.microsoft.com/office/word/2010/wordprocessingCanvas" xmlns:cx="http://schemas.microsoft.com/office/drawing/2014/chartex" xmlns:cx1="http://schemas.microsoft.com/office/drawing/2015/9/8/chartex" xmlns:cx2="http://schemas.microsoft.com/office/drawing/2015/10/21/chartex" xmlns:cx3="http://schemas.microsoft.com/office/drawing/2016/5/9/chartex" xmlns:cx4="http://schemas.microsoft.com/office/drawing/2016/5/10/chartex" xmlns:cx5="http://schemas.microsoft.com/office/drawing/2016/5/11/chartex" xmlns:cx6="http://schemas.microsoft.com/office/drawing/2016/5/12/chartex" xmlns:cx7="http://schemas.microsoft.com/office/drawing/2016/5/13/chartex" xmlns:cx8="http://schemas.microsoft.com/office/drawing/2016/5/14/chartex" xmlns:mc="http://schemas.openxmlformats.org/markup-compatibility/2006" xmlns:aink="http://schemas.microsoft.com/office/drawing/2016/ink" xmlns:am3d="http://schemas.microsoft.com/office/drawing/2017/model3d" xmlns:o="urn:schemas-microsoft-com:office:office" xmlns:oel="http://schemas.microsoft.com/office/2019/extlst" xmlns:r="http://schemas.openxmlformats.org/officeDocument/2006/relationships" xmlns:m="http://schemas.openxmlformats.org/officeDocument/2006/math" xmlns:v="urn:schemas-microsoft-com:vml" xmlns:wp14="http://schemas.microsoft.com/office/word/2010/wordprocessingDrawing" xmlns:wp="http://schemas.openxmlformats.org/drawingml/2006/wordprocessingDrawing" xmlns:w10="urn:schemas-microsoft-com:office:word" xmlns:w="http://schemas.openxmlformats.org/wordprocessingml/2006/main" xmlns:w14="http://schemas.microsoft.com/office/word/2010/wordml" xmlns:w15="http://schemas.microsoft.com/office/word/2012/wordml" xmlns:w16cex="http://schemas.microsoft.com/office/word/2018/wordml/cex" xmlns:w16cid="http://schemas.microsoft.com/office/word/2016/wordml/cid" xmlns:w16="http://schemas.microsoft.com/office/word/2018/wordml" xmlns:w16du="http://schemas.microsoft.com/office/word/2023/wordml/word16du" xmlns:w16sdtdh="http://schemas.microsoft.com/office/word/2020/wordml/sdtdatahash" xmlns:w16sdtfl="http://schemas.microsoft.com/office/word/2024/wordml/sdtformatlock" xmlns:w16se="http://schemas.microsoft.com/office/word/2015/wordml/symex" xmlns:wpg="http://schemas.microsoft.com/office/word/2010/wordprocessingGroup" xmlns:wpi="http://schemas.microsoft.com/office/word/2010/wordprocessingInk" xmlns:wne="http://schemas.microsoft.com/office/word/2006/wordml" xmlns:wps="http://schemas.microsoft.com/office/word/2010/wordprocessingShape" mc:Ignorable="w14 w15 w16se w16cid w16 w16cex w16sdtdh w16sdtfl w16du wp14">
   <w:abstractNum w:abstractNumId="0" w15:restartNumberingAfterBreak="0">
     <w:nsid w:val="65E24D04"/>
     <w:multiLevelType w:val="hybridMultilevel"/>
@@ -7714,6 +8018,19 @@
       </w:tblBorders>
     </w:tblPr>
   </w:style>
+  <w:style w:type="character" w:styleId="HTMLCode">
+    <w:name w:val="HTML Code"/>
+    <w:basedOn w:val="DefaultParagraphFont"/>
+    <w:uiPriority w:val="99"/>
+    <w:semiHidden/>
+    <w:unhideWhenUsed/>
+    <w:rsid w:val="009A3399"/>
+    <w:rPr>
+      <w:rFonts w:ascii="Courier New" w:eastAsia="Times New Roman" w:hAnsi="Courier New" w:cs="Courier New"/>
+      <w:sz w:val="20"/>
+      <w:szCs w:val="20"/>
+    </w:rPr>
+  </w:style>
 </w:styles>
 </file>
 

</xml_diff>